<commit_message>
A node with one thing to do asks about it, and takes no for an answer
The stream and the oak were a description ending in a question nobody could
answer: the last line asked, and the only key on the card started the
minigame. Now the description is the description, and the two answers are
under it — cast a line or continue on, fell the oak or continue on.

A beat marked `pass` is the way out: the beats end there, and nothing is
rolled, played or paid. A way with no `then` is the other one — the beats run
out and the rod or the axe takes over, which is what they already did.

Work cards get the same row wherever there is exactly one thing the party can
do, so a single seam or a single stand is a question too. Two things to do
was a choice already and is left alone. The line said about walking on is on
the card for those; a scene has written its own and does not want a second.

Every string on the encounter card, panel by panel, is in
encounter-dialogue.docx, which follows the change.
</commit_message>
<xml_diff>
--- a/encounter-dialogue.docx
+++ b/encounter-dialogue.docx
@@ -277,7 +277,83 @@
           <w:sz w:val="21"/>
           <w:szCs w:val="21"/>
         </w:rPr>
-        <w:t xml:space="preserve">Skaters and flies ripple on the surface. Cast a line?</w:t>
+        <w:t xml:space="preserve">Skaters and flies ripple on the surface.</w:t>
+      </w:r>
+    </w:p>
+    <w:p>
+      <w:pPr>
+        <w:pBdr>
+          <w:top w:val="single" w:color="E2DDD4" w:sz="4" w:space="10"/>
+        </w:pBdr>
+        <w:spacing w:after="120" w:before="200" w:line="300"/>
+        <w:ind w:left="720" w:hanging="360"/>
+      </w:pPr>
+      <w:r>
+        <w:rPr>
+          <w:rFonts w:ascii="Georgia" w:cs="Georgia" w:eastAsia="Georgia" w:hAnsi="Georgia"/>
+          <w:b/>
+          <w:bCs/>
+          <w:color w:val="7A756C"/>
+          <w:sz w:val="21"/>
+          <w:szCs w:val="21"/>
+        </w:rPr>
+        <w:t xml:space="preserve">&gt; </w:t>
+      </w:r>
+      <w:r>
+        <w:rPr>
+          <w:rFonts w:ascii="Georgia" w:cs="Georgia" w:eastAsia="Georgia" w:hAnsi="Georgia"/>
+          <w:b/>
+          <w:bCs/>
+          <w:color w:val="1B1B1B"/>
+          <w:sz w:val="21"/>
+          <w:szCs w:val="21"/>
+        </w:rPr>
+        <w:t xml:space="preserve">[Cast a line.]</w:t>
+      </w:r>
+    </w:p>
+    <w:p>
+      <w:pPr>
+        <w:spacing w:after="200" w:before="0" w:line="300"/>
+        <w:ind w:left="720" w:hanging="360"/>
+      </w:pPr>
+      <w:r>
+        <w:rPr>
+          <w:rFonts w:ascii="Georgia" w:cs="Georgia" w:eastAsia="Georgia" w:hAnsi="Georgia"/>
+          <w:b/>
+          <w:bCs/>
+          <w:color w:val="7A756C"/>
+          <w:sz w:val="21"/>
+          <w:szCs w:val="21"/>
+        </w:rPr>
+        <w:t xml:space="preserve">&gt; </w:t>
+      </w:r>
+      <w:r>
+        <w:rPr>
+          <w:rFonts w:ascii="Georgia" w:cs="Georgia" w:eastAsia="Georgia" w:hAnsi="Georgia"/>
+          <w:b/>
+          <w:bCs/>
+          <w:color w:val="1B1B1B"/>
+          <w:sz w:val="21"/>
+          <w:szCs w:val="21"/>
+        </w:rPr>
+        <w:t xml:space="preserve">[Continue on.]</w:t>
+      </w:r>
+    </w:p>
+    <w:p>
+      <w:pPr>
+        <w:pBdr>
+          <w:top w:val="single" w:color="E2DDD4" w:sz="4" w:space="10"/>
+        </w:pBdr>
+        <w:spacing w:after="200" w:before="200" w:line="300"/>
+      </w:pPr>
+      <w:r>
+        <w:rPr>
+          <w:rFonts w:ascii="Georgia" w:cs="Georgia" w:eastAsia="Georgia" w:hAnsi="Georgia"/>
+          <w:color w:val="1B1B1B"/>
+          <w:sz w:val="21"/>
+          <w:szCs w:val="21"/>
+        </w:rPr>
+        <w:t xml:space="preserve">You leave the water where it is. The path picks up again inside the treeline.</w:t>
       </w:r>
     </w:p>
     <w:p>
@@ -1540,7 +1616,7 @@
     </w:p>
     <w:p>
       <w:pPr>
-        <w:spacing w:after="120" w:before="0" w:line="300"/>
+        <w:spacing w:after="200" w:before="0" w:line="300"/>
       </w:pPr>
       <w:r>
         <w:rPr>
@@ -1554,16 +1630,78 @@
     </w:p>
     <w:p>
       <w:pPr>
-        <w:spacing w:after="200" w:before="0" w:line="300"/>
-      </w:pPr>
-      <w:r>
-        <w:rPr>
-          <w:rFonts w:ascii="Georgia" w:cs="Georgia" w:eastAsia="Georgia" w:hAnsi="Georgia"/>
-          <w:color w:val="1B1B1B"/>
-          <w:sz w:val="21"/>
-          <w:szCs w:val="21"/>
-        </w:rPr>
-        <w:t xml:space="preserve">Fell the oak?</w:t>
+        <w:pBdr>
+          <w:top w:val="single" w:color="E2DDD4" w:sz="4" w:space="10"/>
+        </w:pBdr>
+        <w:spacing w:after="120" w:before="200" w:line="300"/>
+        <w:ind w:left="720" w:hanging="360"/>
+      </w:pPr>
+      <w:r>
+        <w:rPr>
+          <w:rFonts w:ascii="Georgia" w:cs="Georgia" w:eastAsia="Georgia" w:hAnsi="Georgia"/>
+          <w:b/>
+          <w:bCs/>
+          <w:color w:val="7A756C"/>
+          <w:sz w:val="21"/>
+          <w:szCs w:val="21"/>
+        </w:rPr>
+        <w:t xml:space="preserve">&gt; </w:t>
+      </w:r>
+      <w:r>
+        <w:rPr>
+          <w:rFonts w:ascii="Georgia" w:cs="Georgia" w:eastAsia="Georgia" w:hAnsi="Georgia"/>
+          <w:b/>
+          <w:bCs/>
+          <w:color w:val="1B1B1B"/>
+          <w:sz w:val="21"/>
+          <w:szCs w:val="21"/>
+        </w:rPr>
+        <w:t xml:space="preserve">[Fell the oak.]</w:t>
+      </w:r>
+    </w:p>
+    <w:p>
+      <w:pPr>
+        <w:spacing w:after="200" w:before="0" w:line="300"/>
+        <w:ind w:left="720" w:hanging="360"/>
+      </w:pPr>
+      <w:r>
+        <w:rPr>
+          <w:rFonts w:ascii="Georgia" w:cs="Georgia" w:eastAsia="Georgia" w:hAnsi="Georgia"/>
+          <w:b/>
+          <w:bCs/>
+          <w:color w:val="7A756C"/>
+          <w:sz w:val="21"/>
+          <w:szCs w:val="21"/>
+        </w:rPr>
+        <w:t xml:space="preserve">&gt; </w:t>
+      </w:r>
+      <w:r>
+        <w:rPr>
+          <w:rFonts w:ascii="Georgia" w:cs="Georgia" w:eastAsia="Georgia" w:hAnsi="Georgia"/>
+          <w:b/>
+          <w:bCs/>
+          <w:color w:val="1B1B1B"/>
+          <w:sz w:val="21"/>
+          <w:szCs w:val="21"/>
+        </w:rPr>
+        <w:t xml:space="preserve">[Continue on.]</w:t>
+      </w:r>
+    </w:p>
+    <w:p>
+      <w:pPr>
+        <w:pBdr>
+          <w:top w:val="single" w:color="E2DDD4" w:sz="4" w:space="10"/>
+        </w:pBdr>
+        <w:spacing w:after="200" w:before="200" w:line="300"/>
+      </w:pPr>
+      <w:r>
+        <w:rPr>
+          <w:rFonts w:ascii="Georgia" w:cs="Georgia" w:eastAsia="Georgia" w:hAnsi="Georgia"/>
+          <w:color w:val="1B1B1B"/>
+          <w:sz w:val="21"/>
+          <w:szCs w:val="21"/>
+        </w:rPr>
+        <w:t xml:space="preserve">You leave the oak standing. The limb will still be down the next time anybody comes this way.</w:t>
       </w:r>
     </w:p>
     <w:p>

</xml_diff>